<commit_message>
Literature Review edited. 2.2 removed for redrafting
</commit_message>
<xml_diff>
--- a/Applied-Research Project/03-Literature-Review/04_Literature_Drafts/Literature Review Draft 1.docx
+++ b/Applied-Research Project/03-Literature-Review/04_Literature_Drafts/Literature Review Draft 1.docx
@@ -2632,95 +2632,6 @@
       <w:pPr>
         <w:rPr>
           <w:rFonts w:ascii="Calibri" w:hAnsi="Calibri" w:cs="Calibri"/>
-        </w:rPr>
-      </w:pPr>
-      <w:r>
-        <w:rPr>
-          <w:rFonts w:ascii="Calibri" w:hAnsi="Calibri" w:cs="Calibri"/>
-        </w:rPr>
-        <w:t>Most</w:t>
-      </w:r>
-      <w:r>
-        <w:rPr>
-          <w:rFonts w:ascii="Calibri" w:hAnsi="Calibri" w:cs="Calibri"/>
-        </w:rPr>
-        <w:t xml:space="preserve"> current</w:t>
-      </w:r>
-      <w:r>
-        <w:rPr>
-          <w:rFonts w:ascii="Calibri" w:hAnsi="Calibri" w:cs="Calibri"/>
-        </w:rPr>
-        <w:t xml:space="preserve"> SOCs</w:t>
-      </w:r>
-      <w:r>
-        <w:rPr>
-          <w:rFonts w:ascii="Calibri" w:hAnsi="Calibri" w:cs="Calibri"/>
-        </w:rPr>
-        <w:t xml:space="preserve"> still depend on human oversight.</w:t>
-      </w:r>
-      <w:r>
-        <w:rPr>
-          <w:rFonts w:ascii="Calibri" w:eastAsia="Times New Roman" w:hAnsi="Calibri" w:cs="Calibri"/>
-          <w:kern w:val="0"/>
-          <w:lang w:eastAsia="en-GB"/>
-          <w14:ligatures w14:val="none"/>
-        </w:rPr>
-        <w:t xml:space="preserve"> </w:t>
-      </w:r>
-      <w:r>
-        <w:rPr>
-          <w:rFonts w:ascii="Calibri" w:hAnsi="Calibri" w:cs="Calibri"/>
-        </w:rPr>
-        <w:t xml:space="preserve">Adem et al. (2026) found that human-in-the-loop and human-on-the-loop approaches remain dominant in SOCs, which suggests that the ability of LLMs to operate independently within these environments is still underexplored. </w:t>
-      </w:r>
-      <w:r>
-        <w:rPr>
-          <w:rFonts w:ascii="Calibri" w:hAnsi="Calibri" w:cs="Calibri"/>
-        </w:rPr>
-        <w:t>There is an important difference between an LLM helping an analyst and an LLM being responsible for the investigation itself. This is also relevant to Kramer et al. (2025), where 18 Google security analysts used LLMs across 50 real-world incidents. Although the study showed benefits from collaboration</w:t>
-      </w:r>
-      <w:r>
-        <w:rPr>
-          <w:rFonts w:ascii="Calibri" w:hAnsi="Calibri" w:cs="Calibri"/>
-        </w:rPr>
-        <w:t xml:space="preserve"> between LLMs and human oversight</w:t>
-      </w:r>
-      <w:r>
-        <w:rPr>
-          <w:rFonts w:ascii="Calibri" w:hAnsi="Calibri" w:cs="Calibri"/>
-        </w:rPr>
-        <w:t>, the analysts' experience</w:t>
-      </w:r>
-      <w:r>
-        <w:rPr>
-          <w:rFonts w:ascii="Calibri" w:hAnsi="Calibri" w:cs="Calibri"/>
-        </w:rPr>
-        <w:t xml:space="preserve"> in this field</w:t>
-      </w:r>
-      <w:r>
-        <w:rPr>
-          <w:rFonts w:ascii="Calibri" w:hAnsi="Calibri" w:cs="Calibri"/>
-        </w:rPr>
-        <w:t xml:space="preserve"> could have influenced the results. More experienced analysts are likely to notice incorrect findings, missing evidence and unsupported claims that a less experienced analyst might accept. For this reason, relying on analyst-assisted investigations makes it harder to determine the actual capability of the LLM and provides further justification for evaluating LLMs autonomously.</w:t>
-      </w:r>
-      <w:r>
-        <w:rPr>
-          <w:rFonts w:ascii="Calibri" w:hAnsi="Calibri" w:cs="Calibri"/>
-        </w:rPr>
-        <w:t xml:space="preserve"> </w:t>
-      </w:r>
-      <w:r>
-        <w:rPr>
-          <w:rFonts w:ascii="Calibri" w:hAnsi="Calibri" w:cs="Calibri"/>
-          <w:highlight w:val="yellow"/>
-        </w:rPr>
-        <w:t>TBC</w:t>
-      </w:r>
-    </w:p>
-    <w:p>
-      <w:pPr>
-        <w:rPr>
-          <w:rFonts w:ascii="Calibri" w:hAnsi="Calibri" w:cs="Calibri"/>
           <w:b/>
           <w:bCs/>
           <w:sz w:val="28"/>
@@ -2789,13 +2700,6 @@
       <w:pPr>
         <w:rPr>
           <w:rFonts w:ascii="Calibri" w:hAnsi="Calibri" w:cs="Calibri"/>
-        </w:rPr>
-      </w:pPr>
-    </w:p>
-    <w:p>
-      <w:pPr>
-        <w:rPr>
-          <w:rFonts w:ascii="Calibri" w:hAnsi="Calibri" w:cs="Calibri"/>
           <w:b/>
           <w:bCs/>
           <w:sz w:val="28"/>
@@ -2855,7 +2759,14 @@
         <w:rPr>
           <w:rFonts w:ascii="Calibri" w:hAnsi="Calibri" w:cs="Calibri"/>
         </w:rPr>
-        <w:t xml:space="preserve">Rather than attempting to standardise a variable that can </w:t>
+        <w:t xml:space="preserve">Rather than attempting to </w:t>
+      </w:r>
+      <w:r>
+        <w:rPr>
+          <w:rFonts w:ascii="Calibri" w:hAnsi="Calibri" w:cs="Calibri"/>
+        </w:rPr>
+        <w:lastRenderedPageBreak/>
+        <w:t xml:space="preserve">standardise a variable that can </w:t>
       </w:r>
       <w:r>
         <w:rPr>
@@ -2886,14 +2797,7 @@
           <w:rFonts w:ascii="Calibri" w:hAnsi="Calibri" w:cs="Calibri"/>
           <w:highlight w:val="yellow"/>
         </w:rPr>
-        <w:t xml:space="preserve"> </w:t>
-      </w:r>
-      <w:r>
-        <w:rPr>
-          <w:rFonts w:ascii="Calibri" w:hAnsi="Calibri" w:cs="Calibri"/>
-          <w:highlight w:val="yellow"/>
-        </w:rPr>
-        <w:t>TBC</w:t>
+        <w:t xml:space="preserve"> TBC</w:t>
       </w:r>
     </w:p>
     <w:p>
@@ -3604,6 +3508,7 @@
   <w:style w:type="character" w:default="1" w:styleId="DefaultParagraphFont">
     <w:name w:val="Default Paragraph Font"/>
     <w:uiPriority w:val="1"/>
+    <w:semiHidden/>
     <w:unhideWhenUsed/>
   </w:style>
   <w:style w:type="table" w:default="1" w:styleId="TableNormal">

</xml_diff>

<commit_message>
Update Literature Review Draft 1.docx
</commit_message>
<xml_diff>
--- a/Applied-Research Project/03-Literature-Review/04_Literature_Drafts/Literature Review Draft 1.docx
+++ b/Applied-Research Project/03-Literature-Review/04_Literature_Drafts/Literature Review Draft 1.docx
@@ -2648,7 +2648,29 @@
           <w:szCs w:val="28"/>
           <w:u w:val="single"/>
         </w:rPr>
-        <w:t xml:space="preserve">2.2 </w:t>
+        <w:t>2.</w:t>
+      </w:r>
+      <w:r>
+        <w:rPr>
+          <w:rFonts w:ascii="Calibri" w:hAnsi="Calibri" w:cs="Calibri"/>
+          <w:b/>
+          <w:bCs/>
+          <w:sz w:val="28"/>
+          <w:szCs w:val="28"/>
+          <w:u w:val="single"/>
+        </w:rPr>
+        <w:t>3</w:t>
+      </w:r>
+      <w:r>
+        <w:rPr>
+          <w:rFonts w:ascii="Calibri" w:hAnsi="Calibri" w:cs="Calibri"/>
+          <w:b/>
+          <w:bCs/>
+          <w:sz w:val="28"/>
+          <w:szCs w:val="28"/>
+          <w:u w:val="single"/>
+        </w:rPr>
+        <w:t xml:space="preserve"> </w:t>
       </w:r>
       <w:r>
         <w:rPr>

</xml_diff>